<commit_message>
menambahkan data pengukuran tegangan
</commit_message>
<xml_diff>
--- a/Technical Note/LED dan Pushbutton.docx
+++ b/Technical Note/LED dan Pushbutton.docx
@@ -128,7 +128,7 @@
           <w:noProof/>
         </w:rPr>
         <w:drawing>
-          <wp:inline distT="0" distB="0" distL="0" distR="0" wp14:anchorId="29ACA3A6" wp14:editId="178C1E19">
+          <wp:inline distT="0" distB="0" distL="0" distR="0" wp14:anchorId="29ACA3A6" wp14:editId="0CC0A002">
             <wp:extent cx="4887746" cy="2748748"/>
             <wp:effectExtent l="0" t="0" r="8255" b="0"/>
             <wp:docPr id="1421690704" name="Picture 1"/>
@@ -2792,25 +2792,7 @@
           <w:sz w:val="20"/>
           <w:szCs w:val="20"/>
         </w:rPr>
-        <w:t xml:space="preserve"> </w:t>
-      </w:r>
-      <w:proofErr w:type="spellStart"/>
-      <w:r>
-        <w:rPr>
-          <w:rFonts w:ascii="Courier New" w:hAnsi="Courier New" w:cs="Courier New"/>
-          <w:sz w:val="20"/>
-          <w:szCs w:val="20"/>
-        </w:rPr>
-        <w:t>ditekan</w:t>
-      </w:r>
-      <w:proofErr w:type="spellEnd"/>
-      <w:r>
-        <w:rPr>
-          <w:rFonts w:ascii="Courier New" w:hAnsi="Courier New" w:cs="Courier New"/>
-          <w:sz w:val="20"/>
-          <w:szCs w:val="20"/>
-        </w:rPr>
-        <w:t>! Total: ");</w:t>
+        <w:t xml:space="preserve"> ditekan! Total: ");</w:t>
       </w:r>
     </w:p>
     <w:p>
@@ -3302,6 +3284,353 @@
         <w:rPr>
           <w:rFonts w:ascii="Times New Roman" w:hAnsi="Times New Roman" w:cs="Times New Roman"/>
         </w:rPr>
+        <w:t>Measure</w:t>
+      </w:r>
+      <w:r>
+        <w:rPr>
+          <w:rFonts w:ascii="Times New Roman" w:hAnsi="Times New Roman" w:cs="Times New Roman"/>
+        </w:rPr>
+        <w:t xml:space="preserve"> digital pin output voltage</w:t>
+      </w:r>
+    </w:p>
+    <w:p>
+      <w:pPr>
+        <w:keepNext/>
+        <w:spacing w:after="0"/>
+        <w:jc w:val="center"/>
+      </w:pPr>
+      <w:r>
+        <w:rPr>
+          <w:noProof/>
+        </w:rPr>
+        <w:drawing>
+          <wp:inline distT="0" distB="0" distL="0" distR="0" wp14:anchorId="5A1527A7" wp14:editId="71E8D858">
+            <wp:extent cx="2636216" cy="3043776"/>
+            <wp:effectExtent l="0" t="0" r="0" b="4445"/>
+            <wp:docPr id="1995875691" name="Picture 1"/>
+            <wp:cNvGraphicFramePr>
+              <a:graphicFrameLocks xmlns:a="http://schemas.openxmlformats.org/drawingml/2006/main" noChangeAspect="1"/>
+            </wp:cNvGraphicFramePr>
+            <a:graphic xmlns:a="http://schemas.openxmlformats.org/drawingml/2006/main">
+              <a:graphicData uri="http://schemas.openxmlformats.org/drawingml/2006/picture">
+                <pic:pic xmlns:pic="http://schemas.openxmlformats.org/drawingml/2006/picture">
+                  <pic:nvPicPr>
+                    <pic:cNvPr id="0" name="Picture 1"/>
+                    <pic:cNvPicPr>
+                      <a:picLocks noChangeAspect="1" noChangeArrowheads="1"/>
+                    </pic:cNvPicPr>
+                  </pic:nvPicPr>
+                  <pic:blipFill rotWithShape="1">
+                    <a:blip r:embed="rId6" cstate="print">
+                      <a:extLst>
+                        <a:ext uri="{28A0092B-C50C-407E-A947-70E740481C1C}">
+                          <a14:useLocalDpi xmlns:a14="http://schemas.microsoft.com/office/drawing/2010/main" val="0"/>
+                        </a:ext>
+                      </a:extLst>
+                    </a:blip>
+                    <a:srcRect l="20265" t="22338" b="25892"/>
+                    <a:stretch>
+                      <a:fillRect/>
+                    </a:stretch>
+                  </pic:blipFill>
+                  <pic:spPr bwMode="auto">
+                    <a:xfrm>
+                      <a:off x="0" y="0"/>
+                      <a:ext cx="2636216" cy="3043776"/>
+                    </a:xfrm>
+                    <a:prstGeom prst="rect">
+                      <a:avLst/>
+                    </a:prstGeom>
+                    <a:noFill/>
+                    <a:ln>
+                      <a:noFill/>
+                    </a:ln>
+                    <a:extLst>
+                      <a:ext uri="{53640926-AAD7-44D8-BBD7-CCE9431645EC}">
+                        <a14:shadowObscured xmlns:a14="http://schemas.microsoft.com/office/drawing/2010/main"/>
+                      </a:ext>
+                    </a:extLst>
+                  </pic:spPr>
+                </pic:pic>
+              </a:graphicData>
+            </a:graphic>
+          </wp:inline>
+        </w:drawing>
+      </w:r>
+    </w:p>
+    <w:p>
+      <w:pPr>
+        <w:pStyle w:val="Caption"/>
+        <w:jc w:val="center"/>
+      </w:pPr>
+      <w:r>
+        <w:t xml:space="preserve">Gambar </w:t>
+      </w:r>
+      <w:fldSimple w:instr=" SEQ Gambar \* ARABIC ">
+        <w:r>
+          <w:rPr>
+            <w:noProof/>
+          </w:rPr>
+          <w:t>1</w:t>
+        </w:r>
+      </w:fldSimple>
+      <w:r>
+        <w:t xml:space="preserve"> </w:t>
+      </w:r>
+      <w:proofErr w:type="spellStart"/>
+      <w:r>
+        <w:t>Tegangan</w:t>
+      </w:r>
+      <w:proofErr w:type="spellEnd"/>
+      <w:r>
+        <w:t xml:space="preserve"> button </w:t>
+      </w:r>
+      <w:proofErr w:type="spellStart"/>
+      <w:r>
+        <w:t>ketika</w:t>
+      </w:r>
+      <w:proofErr w:type="spellEnd"/>
+      <w:r>
+        <w:t xml:space="preserve"> on</w:t>
+      </w:r>
+    </w:p>
+    <w:p>
+      <w:pPr>
+        <w:keepNext/>
+        <w:jc w:val="center"/>
+      </w:pPr>
+    </w:p>
+    <w:p>
+      <w:pPr>
+        <w:keepNext/>
+        <w:spacing w:after="0"/>
+        <w:jc w:val="center"/>
+      </w:pPr>
+      <w:r>
+        <w:rPr>
+          <w:noProof/>
+        </w:rPr>
+        <w:drawing>
+          <wp:inline distT="0" distB="0" distL="0" distR="0" wp14:anchorId="19A21BA2" wp14:editId="42615C33">
+            <wp:extent cx="2529994" cy="3775958"/>
+            <wp:effectExtent l="0" t="0" r="3810" b="0"/>
+            <wp:docPr id="688570111" name="Picture 3"/>
+            <wp:cNvGraphicFramePr>
+              <a:graphicFrameLocks xmlns:a="http://schemas.openxmlformats.org/drawingml/2006/main" noChangeAspect="1"/>
+            </wp:cNvGraphicFramePr>
+            <a:graphic xmlns:a="http://schemas.openxmlformats.org/drawingml/2006/main">
+              <a:graphicData uri="http://schemas.openxmlformats.org/drawingml/2006/picture">
+                <pic:pic xmlns:pic="http://schemas.openxmlformats.org/drawingml/2006/picture">
+                  <pic:nvPicPr>
+                    <pic:cNvPr id="0" name="Picture 5"/>
+                    <pic:cNvPicPr>
+                      <a:picLocks noChangeAspect="1" noChangeArrowheads="1"/>
+                    </pic:cNvPicPr>
+                  </pic:nvPicPr>
+                  <pic:blipFill rotWithShape="1">
+                    <a:blip r:embed="rId7">
+                      <a:extLst>
+                        <a:ext uri="{28A0092B-C50C-407E-A947-70E740481C1C}">
+                          <a14:useLocalDpi xmlns:a14="http://schemas.microsoft.com/office/drawing/2010/main" val="0"/>
+                        </a:ext>
+                      </a:extLst>
+                    </a:blip>
+                    <a:srcRect l="19146" t="17763" r="14791" b="26793"/>
+                    <a:stretch>
+                      <a:fillRect/>
+                    </a:stretch>
+                  </pic:blipFill>
+                  <pic:spPr bwMode="auto">
+                    <a:xfrm>
+                      <a:off x="0" y="0"/>
+                      <a:ext cx="2537241" cy="3786774"/>
+                    </a:xfrm>
+                    <a:prstGeom prst="rect">
+                      <a:avLst/>
+                    </a:prstGeom>
+                    <a:noFill/>
+                    <a:ln>
+                      <a:noFill/>
+                    </a:ln>
+                    <a:extLst>
+                      <a:ext uri="{53640926-AAD7-44D8-BBD7-CCE9431645EC}">
+                        <a14:shadowObscured xmlns:a14="http://schemas.microsoft.com/office/drawing/2010/main"/>
+                      </a:ext>
+                    </a:extLst>
+                  </pic:spPr>
+                </pic:pic>
+              </a:graphicData>
+            </a:graphic>
+          </wp:inline>
+        </w:drawing>
+      </w:r>
+    </w:p>
+    <w:p>
+      <w:pPr>
+        <w:pStyle w:val="Caption"/>
+        <w:spacing w:after="0"/>
+        <w:jc w:val="center"/>
+      </w:pPr>
+      <w:r>
+        <w:t xml:space="preserve">Gambar </w:t>
+      </w:r>
+      <w:fldSimple w:instr=" SEQ Gambar \* ARABIC ">
+        <w:r>
+          <w:rPr>
+            <w:noProof/>
+          </w:rPr>
+          <w:t>2</w:t>
+        </w:r>
+      </w:fldSimple>
+      <w:r>
+        <w:t xml:space="preserve"> </w:t>
+      </w:r>
+      <w:proofErr w:type="spellStart"/>
+      <w:r>
+        <w:t>Tegangan</w:t>
+      </w:r>
+      <w:proofErr w:type="spellEnd"/>
+      <w:r>
+        <w:t xml:space="preserve"> button </w:t>
+      </w:r>
+      <w:proofErr w:type="spellStart"/>
+      <w:r>
+        <w:t>ketika</w:t>
+      </w:r>
+      <w:proofErr w:type="spellEnd"/>
+      <w:r>
+        <w:t xml:space="preserve"> off</w:t>
+      </w:r>
+    </w:p>
+    <w:p>
+      <w:pPr>
+        <w:keepNext/>
+        <w:spacing w:after="0"/>
+        <w:jc w:val="center"/>
+      </w:pPr>
+      <w:r>
+        <w:rPr>
+          <w:noProof/>
+        </w:rPr>
+        <w:drawing>
+          <wp:inline distT="0" distB="0" distL="0" distR="0" wp14:anchorId="25A0E67A" wp14:editId="28B6A453">
+            <wp:extent cx="2515921" cy="3780597"/>
+            <wp:effectExtent l="0" t="0" r="0" b="0"/>
+            <wp:docPr id="1106453944" name="Picture 2"/>
+            <wp:cNvGraphicFramePr>
+              <a:graphicFrameLocks xmlns:a="http://schemas.openxmlformats.org/drawingml/2006/main" noChangeAspect="1"/>
+            </wp:cNvGraphicFramePr>
+            <a:graphic xmlns:a="http://schemas.openxmlformats.org/drawingml/2006/main">
+              <a:graphicData uri="http://schemas.openxmlformats.org/drawingml/2006/picture">
+                <pic:pic xmlns:pic="http://schemas.openxmlformats.org/drawingml/2006/picture">
+                  <pic:nvPicPr>
+                    <pic:cNvPr id="0" name="Picture 3"/>
+                    <pic:cNvPicPr>
+                      <a:picLocks noChangeAspect="1" noChangeArrowheads="1"/>
+                    </pic:cNvPicPr>
+                  </pic:nvPicPr>
+                  <pic:blipFill rotWithShape="1">
+                    <a:blip r:embed="rId8" cstate="print">
+                      <a:extLst>
+                        <a:ext uri="{28A0092B-C50C-407E-A947-70E740481C1C}">
+                          <a14:useLocalDpi xmlns:a14="http://schemas.microsoft.com/office/drawing/2010/main" val="0"/>
+                        </a:ext>
+                      </a:extLst>
+                    </a:blip>
+                    <a:srcRect l="20901" t="17943" b="15219"/>
+                    <a:stretch>
+                      <a:fillRect/>
+                    </a:stretch>
+                  </pic:blipFill>
+                  <pic:spPr bwMode="auto">
+                    <a:xfrm>
+                      <a:off x="0" y="0"/>
+                      <a:ext cx="2523960" cy="3792676"/>
+                    </a:xfrm>
+                    <a:prstGeom prst="rect">
+                      <a:avLst/>
+                    </a:prstGeom>
+                    <a:noFill/>
+                    <a:ln>
+                      <a:noFill/>
+                    </a:ln>
+                    <a:extLst>
+                      <a:ext uri="{53640926-AAD7-44D8-BBD7-CCE9431645EC}">
+                        <a14:shadowObscured xmlns:a14="http://schemas.microsoft.com/office/drawing/2010/main"/>
+                      </a:ext>
+                    </a:extLst>
+                  </pic:spPr>
+                </pic:pic>
+              </a:graphicData>
+            </a:graphic>
+          </wp:inline>
+        </w:drawing>
+      </w:r>
+    </w:p>
+    <w:p>
+      <w:pPr>
+        <w:pStyle w:val="Caption"/>
+        <w:spacing w:after="0"/>
+        <w:jc w:val="center"/>
+      </w:pPr>
+      <w:r>
+        <w:t xml:space="preserve">Gambar </w:t>
+      </w:r>
+      <w:fldSimple w:instr=" SEQ Gambar \* ARABIC ">
+        <w:r>
+          <w:rPr>
+            <w:noProof/>
+          </w:rPr>
+          <w:t>3</w:t>
+        </w:r>
+      </w:fldSimple>
+      <w:r>
+        <w:t xml:space="preserve"> </w:t>
+      </w:r>
+      <w:proofErr w:type="spellStart"/>
+      <w:r>
+        <w:t>Tegangan</w:t>
+      </w:r>
+      <w:proofErr w:type="spellEnd"/>
+      <w:r>
+        <w:t xml:space="preserve"> LED </w:t>
+      </w:r>
+      <w:proofErr w:type="spellStart"/>
+      <w:r>
+        <w:t>ketika</w:t>
+      </w:r>
+      <w:proofErr w:type="spellEnd"/>
+      <w:r>
+        <w:t xml:space="preserve"> on</w:t>
+      </w:r>
+    </w:p>
+    <w:p/>
+    <w:p>
+      <w:pPr>
+        <w:spacing w:after="0"/>
+        <w:jc w:val="center"/>
+        <w:rPr>
+          <w:rFonts w:ascii="Times New Roman" w:hAnsi="Times New Roman" w:cs="Times New Roman"/>
+        </w:rPr>
+      </w:pPr>
+    </w:p>
+    <w:p>
+      <w:pPr>
+        <w:pStyle w:val="ListParagraph"/>
+        <w:numPr>
+          <w:ilvl w:val="0"/>
+          <w:numId w:val="1"/>
+        </w:numPr>
+        <w:spacing w:after="0"/>
+        <w:jc w:val="left"/>
+        <w:rPr>
+          <w:rFonts w:ascii="Times New Roman" w:hAnsi="Times New Roman" w:cs="Times New Roman"/>
+        </w:rPr>
+      </w:pPr>
+      <w:r>
+        <w:rPr>
+          <w:rFonts w:ascii="Times New Roman" w:hAnsi="Times New Roman" w:cs="Times New Roman"/>
+        </w:rPr>
         <w:t xml:space="preserve">Link </w:t>
       </w:r>
       <w:proofErr w:type="spellStart"/>
@@ -3318,7 +3647,7 @@
         </w:rPr>
         <w:t xml:space="preserve">: </w:t>
       </w:r>
-      <w:hyperlink r:id="rId6" w:history="1">
+      <w:hyperlink r:id="rId9" w:history="1">
         <w:r>
           <w:rPr>
             <w:rStyle w:val="Hyperlink"/>
@@ -4412,6 +4741,25 @@
       <w:shd w:val="clear" w:color="auto" w:fill="E1DFDD"/>
     </w:rPr>
   </w:style>
+  <w:style w:type="paragraph" w:styleId="Caption">
+    <w:name w:val="caption"/>
+    <w:basedOn w:val="Normal"/>
+    <w:next w:val="Normal"/>
+    <w:uiPriority w:val="35"/>
+    <w:unhideWhenUsed/>
+    <w:qFormat/>
+    <w:rsid w:val="00B52742"/>
+    <w:pPr>
+      <w:spacing w:after="200" w:line="240" w:lineRule="auto"/>
+    </w:pPr>
+    <w:rPr>
+      <w:i/>
+      <w:iCs/>
+      <w:color w:val="44546A" w:themeColor="text2"/>
+      <w:sz w:val="18"/>
+      <w:szCs w:val="18"/>
+    </w:rPr>
+  </w:style>
 </w:styles>
 </file>
 

</xml_diff>